<commit_message>
Add script to update monitoring form with project objectives, activities, and self-assessment
- Implemented a Python script using python-docx to populate a Word document with project objectives, detailed activities, and self-assessment metrics.
- Structured the document to include sections for objectives, activities timeline, challenges faced, feedback received, and self-assessment scores.
- Ensured the final document is saved at the specified path for easy access and review.
</commit_message>
<xml_diff>
--- a/.local/REYES_MONTHLY_OJT_MONITORING_FORM_UPDATED_WORKING.docx
+++ b/.local/REYES_MONTHLY_OJT_MONITORING_FORM_UPDATED_WORKING.docx
@@ -276,10 +276,7 @@
               <w:t>Objective 1</w:t>
             </w:r>
             <w:r>
-              <w:t xml:space="preserve">: </w:t>
-            </w:r>
-            <w:r>
-              <w:t>Extract, clean, and structure raw student data to serve as the backend data source.</w:t>
+              <w:t>: Organize and structure student portfolio information into a consistent data model that can support search, filtering, publication status, and future relational database integration.</w:t>
             </w:r>
           </w:p>
           <w:p/>
@@ -292,13 +289,7 @@
               <w:t>Objective 2</w:t>
             </w:r>
             <w:r>
-              <w:t>:</w:t>
-            </w:r>
-            <w:r>
-              <w:t xml:space="preserve"> </w:t>
-            </w:r>
-            <w:r>
-              <w:t>Design, develop, and deploy an interactive visual dashboard for the student portfolio project.</w:t>
+              <w:t>: Design and implement a professional Student Portfolio Dashboard aligned with Mapua University and SOIT presentation needs, including a public directory, detailed student profile view, visitor submission form, and responsive institutional interface.</w:t>
             </w:r>
           </w:p>
           <w:p/>
@@ -311,16 +302,22 @@
               <w:t>Objective 3</w:t>
             </w:r>
             <w:r>
-              <w:t>:</w:t>
-            </w:r>
-            <w:r>
-              <w:t xml:space="preserve"> </w:t>
-            </w:r>
-            <w:r>
-              <w:t>Finalize system testing, debug integration issues, and draft comprehensive user documentation and maintenance guides.</w:t>
+              <w:t>: Develop a private administration workflow for reviewing, editing, approving, returning with comments, archiving, restoring, and deleting student profile records while preserving session state in the prototype.</w:t>
             </w:r>
           </w:p>
           <w:p/>
+          <w:p>
+            <w:r>
+              <w:rPr>
+                <w:b/>
+                <w:bCs/>
+              </w:rPr>
+              <w:t>Objective 4:</w:t>
+            </w:r>
+            <w:r>
+              <w:t xml:space="preserve"> Prepare defense-ready documentation, including product requirements, system architecture, user flow, database schema, running instructions, presentation structure, and updated project-document content.</w:t>
+            </w:r>
+          </w:p>
         </w:tc>
       </w:tr>
     </w:tbl>
@@ -353,11 +350,11 @@
         <w:tblLook w:val="04A0" w:firstRow="1" w:lastRow="0" w:firstColumn="1" w:lastColumn="0" w:noHBand="0" w:noVBand="1"/>
       </w:tblPr>
       <w:tblGrid>
-        <w:gridCol w:w="1670"/>
-        <w:gridCol w:w="1886"/>
-        <w:gridCol w:w="1657"/>
-        <w:gridCol w:w="1737"/>
-        <w:gridCol w:w="1888"/>
+        <w:gridCol w:w="1596"/>
+        <w:gridCol w:w="2136"/>
+        <w:gridCol w:w="1614"/>
+        <w:gridCol w:w="1726"/>
+        <w:gridCol w:w="1766"/>
       </w:tblGrid>
       <w:tr>
         <w:tc>
@@ -487,12 +484,8 @@
             <w:tcW w:w="1767" w:type="dxa"/>
           </w:tcPr>
           <w:p>
-            <w:pPr>
-              <w:pStyle w:val="ListParagraph"/>
-              <w:ind w:left="0"/>
-            </w:pPr>
             <w:r>
-              <w:t>May 22 – May 23</w:t>
+              <w:t>May 22 - May 23</w:t>
             </w:r>
           </w:p>
         </w:tc>
@@ -501,12 +494,8 @@
             <w:tcW w:w="1768" w:type="dxa"/>
           </w:tcPr>
           <w:p>
-            <w:pPr>
-              <w:pStyle w:val="ListParagraph"/>
-              <w:ind w:left="0"/>
-            </w:pPr>
             <w:r>
-              <w:t>Project scoping, requirement analysis, and initial dataset gathering.</w:t>
+              <w:t>Defined the scope of the Student Portfolio Dashboard, reviewed the needs of the SOIT portfolio workflow, and identified the major user groups for the system.</w:t>
             </w:r>
           </w:p>
         </w:tc>
@@ -515,10 +504,6 @@
             <w:tcW w:w="1767" w:type="dxa"/>
           </w:tcPr>
           <w:p>
-            <w:pPr>
-              <w:pStyle w:val="ListParagraph"/>
-              <w:ind w:left="0"/>
-            </w:pPr>
             <w:r>
               <w:t>20 hours</w:t>
             </w:r>
@@ -529,12 +514,8 @@
             <w:tcW w:w="1768" w:type="dxa"/>
           </w:tcPr>
           <w:p>
-            <w:pPr>
-              <w:pStyle w:val="ListParagraph"/>
-              <w:ind w:left="0"/>
-            </w:pPr>
             <w:r>
-              <w:t>Project outline, raw data repository</w:t>
+              <w:t>Project scope, user roles, initial dashboard requirements</w:t>
             </w:r>
           </w:p>
         </w:tc>
@@ -543,12 +524,8 @@
             <w:tcW w:w="1768" w:type="dxa"/>
           </w:tcPr>
           <w:p>
-            <w:pPr>
-              <w:pStyle w:val="ListParagraph"/>
-              <w:ind w:left="0"/>
-            </w:pPr>
             <w:r>
-              <w:t>Requirements Gathering, Project Planning</w:t>
+              <w:t>Requirements Analysis, Academic Project Planning</w:t>
             </w:r>
           </w:p>
         </w:tc>
@@ -559,15 +536,8 @@
             <w:tcW w:w="1767" w:type="dxa"/>
           </w:tcPr>
           <w:p>
-            <w:pPr>
-              <w:pStyle w:val="ListParagraph"/>
-              <w:ind w:left="0"/>
-            </w:pPr>
             <w:r>
-              <w:t xml:space="preserve">May 25 – May </w:t>
-            </w:r>
-            <w:r>
-              <w:t>29</w:t>
+              <w:t>May 25 - May 29</w:t>
             </w:r>
           </w:p>
         </w:tc>
@@ -576,12 +546,12 @@
             <w:tcW w:w="1768" w:type="dxa"/>
           </w:tcPr>
           <w:p>
-            <w:pPr>
-              <w:pStyle w:val="ListParagraph"/>
-              <w:ind w:left="0"/>
-            </w:pPr>
             <w:r>
-              <w:t>Database schema design and extraction of backend student data sources.</w:t>
+              <w:t xml:space="preserve">Structured the student profile data </w:t>
+            </w:r>
+            <w:r>
+              <w:lastRenderedPageBreak/>
+              <w:t>model, identified academic and portfolio fields, and prepared the relational database direction for future production use.</w:t>
             </w:r>
           </w:p>
         </w:tc>
@@ -590,15 +560,9 @@
             <w:tcW w:w="1767" w:type="dxa"/>
           </w:tcPr>
           <w:p>
-            <w:pPr>
-              <w:pStyle w:val="ListParagraph"/>
-              <w:ind w:left="0"/>
-            </w:pPr>
             <w:r>
-              <w:t>5</w:t>
-            </w:r>
-            <w:r>
-              <w:t>0 hours</w:t>
+              <w:lastRenderedPageBreak/>
+              <w:t>50 hours</w:t>
             </w:r>
           </w:p>
         </w:tc>
@@ -607,12 +571,12 @@
             <w:tcW w:w="1768" w:type="dxa"/>
           </w:tcPr>
           <w:p>
-            <w:pPr>
-              <w:pStyle w:val="ListParagraph"/>
-              <w:ind w:left="0"/>
-            </w:pPr>
             <w:r>
-              <w:t>Structured database schema, initial data extracts</w:t>
+              <w:t xml:space="preserve">Structured content model </w:t>
+            </w:r>
+            <w:r>
+              <w:lastRenderedPageBreak/>
+              <w:t>and initial database schema direction</w:t>
             </w:r>
           </w:p>
         </w:tc>
@@ -621,12 +585,13 @@
             <w:tcW w:w="1768" w:type="dxa"/>
           </w:tcPr>
           <w:p>
-            <w:pPr>
-              <w:pStyle w:val="ListParagraph"/>
-              <w:ind w:left="0"/>
-            </w:pPr>
             <w:r>
-              <w:t>Data Extraction, Database Management (SQL)</w:t>
+              <w:lastRenderedPageBreak/>
+              <w:t xml:space="preserve">Data Modeling, SQL Schema </w:t>
+            </w:r>
+            <w:r>
+              <w:lastRenderedPageBreak/>
+              <w:t>Planning</w:t>
             </w:r>
           </w:p>
         </w:tc>
@@ -637,15 +602,8 @@
             <w:tcW w:w="1767" w:type="dxa"/>
           </w:tcPr>
           <w:p>
-            <w:pPr>
-              <w:pStyle w:val="ListParagraph"/>
-              <w:ind w:left="0"/>
-            </w:pPr>
             <w:r>
-              <w:t xml:space="preserve">June 1 – June </w:t>
-            </w:r>
-            <w:r>
-              <w:t>5</w:t>
+              <w:t>June 1 - June 5</w:t>
             </w:r>
           </w:p>
         </w:tc>
@@ -654,12 +612,8 @@
             <w:tcW w:w="1768" w:type="dxa"/>
           </w:tcPr>
           <w:p>
-            <w:pPr>
-              <w:pStyle w:val="ListParagraph"/>
-              <w:ind w:left="0"/>
-            </w:pPr>
             <w:r>
-              <w:t>Extensive data cleaning, structuring, and formatting to ensure reliable information feeding.</w:t>
+              <w:t>Cleaned and standardized sample student records, including year level, course category, availability, skills, profile biography, selected outcomes, and project evidence.</w:t>
             </w:r>
           </w:p>
         </w:tc>
@@ -668,15 +622,8 @@
             <w:tcW w:w="1767" w:type="dxa"/>
           </w:tcPr>
           <w:p>
-            <w:pPr>
-              <w:pStyle w:val="ListParagraph"/>
-              <w:ind w:left="0"/>
-            </w:pPr>
             <w:r>
-              <w:t>5</w:t>
-            </w:r>
-            <w:r>
-              <w:t>0 hours</w:t>
+              <w:t>50 hours</w:t>
             </w:r>
           </w:p>
         </w:tc>
@@ -685,12 +632,8 @@
             <w:tcW w:w="1768" w:type="dxa"/>
           </w:tcPr>
           <w:p>
-            <w:pPr>
-              <w:pStyle w:val="ListParagraph"/>
-              <w:ind w:left="0"/>
-            </w:pPr>
             <w:r>
-              <w:t>Cleaned backend dataset ready for integration</w:t>
+              <w:t>Cleaned profile dataset with more than thirty sample records</w:t>
             </w:r>
           </w:p>
         </w:tc>
@@ -699,12 +642,8 @@
             <w:tcW w:w="1768" w:type="dxa"/>
           </w:tcPr>
           <w:p>
-            <w:pPr>
-              <w:pStyle w:val="ListParagraph"/>
-              <w:ind w:left="0"/>
-            </w:pPr>
             <w:r>
-              <w:t>Data Cleansing (Python/Pandas), Data Wrangling</w:t>
+              <w:t>Data Cleaning, Data Structuring, Information Architecture</w:t>
             </w:r>
           </w:p>
         </w:tc>
@@ -715,19 +654,8 @@
             <w:tcW w:w="1767" w:type="dxa"/>
           </w:tcPr>
           <w:p>
-            <w:pPr>
-              <w:pStyle w:val="ListParagraph"/>
-              <w:ind w:left="0"/>
-            </w:pPr>
             <w:r>
-              <w:t xml:space="preserve">June 8 – June </w:t>
-            </w:r>
-            <w:r>
-              <w:lastRenderedPageBreak/>
-              <w:t>1</w:t>
-            </w:r>
-            <w:r>
-              <w:t>2</w:t>
+              <w:t>June 8 - June 12</w:t>
             </w:r>
           </w:p>
         </w:tc>
@@ -736,17 +664,8 @@
             <w:tcW w:w="1768" w:type="dxa"/>
           </w:tcPr>
           <w:p>
-            <w:pPr>
-              <w:pStyle w:val="ListParagraph"/>
-              <w:ind w:left="0"/>
-            </w:pPr>
             <w:r>
-              <w:lastRenderedPageBreak/>
-              <w:t xml:space="preserve">UI/UX </w:t>
-            </w:r>
-            <w:r>
-              <w:lastRenderedPageBreak/>
-              <w:t>conceptualization and initial frontend setup for the visual dashboard.</w:t>
+              <w:t>Designed and implemented the public-facing dashboard interface using an institutional red, gold, and white visual direction appropriate for a Mapua University prototype.</w:t>
             </w:r>
           </w:p>
         </w:tc>
@@ -755,16 +674,8 @@
             <w:tcW w:w="1767" w:type="dxa"/>
           </w:tcPr>
           <w:p>
-            <w:pPr>
-              <w:pStyle w:val="ListParagraph"/>
-              <w:ind w:left="0"/>
-            </w:pPr>
             <w:r>
-              <w:lastRenderedPageBreak/>
-              <w:t>5</w:t>
-            </w:r>
-            <w:r>
-              <w:t xml:space="preserve">0 hours </w:t>
+              <w:t>50 hours</w:t>
             </w:r>
           </w:p>
         </w:tc>
@@ -773,16 +684,8 @@
             <w:tcW w:w="1768" w:type="dxa"/>
           </w:tcPr>
           <w:p>
-            <w:pPr>
-              <w:pStyle w:val="ListParagraph"/>
-              <w:ind w:left="0"/>
-            </w:pPr>
             <w:r>
-              <w:t xml:space="preserve">Dashboard </w:t>
-            </w:r>
-            <w:r>
-              <w:lastRenderedPageBreak/>
-              <w:t>wireframes, initial UI interface</w:t>
+              <w:t>Public directory layout, profile cards, hero section, responsive styling</w:t>
             </w:r>
           </w:p>
         </w:tc>
@@ -791,17 +694,8 @@
             <w:tcW w:w="1768" w:type="dxa"/>
           </w:tcPr>
           <w:p>
-            <w:pPr>
-              <w:pStyle w:val="ListParagraph"/>
-              <w:ind w:left="0"/>
-            </w:pPr>
             <w:r>
-              <w:lastRenderedPageBreak/>
-              <w:t xml:space="preserve">UI/UX Design, </w:t>
-            </w:r>
-            <w:r>
-              <w:lastRenderedPageBreak/>
-              <w:t>Data Visualization</w:t>
+              <w:t>UI/UX Design, Frontend Development, Accessibility Awareness</w:t>
             </w:r>
           </w:p>
         </w:tc>
@@ -812,16 +706,8 @@
             <w:tcW w:w="1767" w:type="dxa"/>
           </w:tcPr>
           <w:p>
-            <w:pPr>
-              <w:pStyle w:val="ListParagraph"/>
-              <w:ind w:left="0"/>
-            </w:pPr>
             <w:r>
-              <w:lastRenderedPageBreak/>
-              <w:t xml:space="preserve">June 15 – June </w:t>
-            </w:r>
-            <w:r>
-              <w:t>19</w:t>
+              <w:t>June 15 - June 19</w:t>
             </w:r>
           </w:p>
         </w:tc>
@@ -830,12 +716,8 @@
             <w:tcW w:w="1768" w:type="dxa"/>
           </w:tcPr>
           <w:p>
-            <w:pPr>
-              <w:pStyle w:val="ListParagraph"/>
-              <w:ind w:left="0"/>
-            </w:pPr>
             <w:r>
-              <w:t>Inserting structured data into the interface and linking backend with dashboard visuals.</w:t>
+              <w:t>Integrated the structured student data into the static frontend, implemented search, filters, sorting, detailed profile panels, and the public profile submission form.</w:t>
             </w:r>
           </w:p>
         </w:tc>
@@ -844,15 +726,8 @@
             <w:tcW w:w="1767" w:type="dxa"/>
           </w:tcPr>
           <w:p>
-            <w:pPr>
-              <w:pStyle w:val="ListParagraph"/>
-              <w:ind w:left="0"/>
-            </w:pPr>
             <w:r>
-              <w:t>5</w:t>
-            </w:r>
-            <w:r>
-              <w:t xml:space="preserve">0 hours </w:t>
+              <w:t>50 hours</w:t>
             </w:r>
           </w:p>
         </w:tc>
@@ -861,12 +736,8 @@
             <w:tcW w:w="1768" w:type="dxa"/>
           </w:tcPr>
           <w:p>
-            <w:pPr>
-              <w:pStyle w:val="ListParagraph"/>
-              <w:ind w:left="0"/>
-            </w:pPr>
             <w:r>
-              <w:t>Functional dashboard prototype</w:t>
+              <w:t>Functional public portfolio dashboard and visitor submission workflow</w:t>
             </w:r>
           </w:p>
         </w:tc>
@@ -875,12 +746,8 @@
             <w:tcW w:w="1768" w:type="dxa"/>
           </w:tcPr>
           <w:p>
-            <w:pPr>
-              <w:pStyle w:val="ListParagraph"/>
-              <w:ind w:left="0"/>
-            </w:pPr>
             <w:r>
-              <w:t>System Integration, API Handling</w:t>
+              <w:t>JavaScript Rendering, State Handling, Interface Logic</w:t>
             </w:r>
           </w:p>
         </w:tc>
@@ -891,15 +758,8 @@
             <w:tcW w:w="1767" w:type="dxa"/>
           </w:tcPr>
           <w:p>
-            <w:pPr>
-              <w:pStyle w:val="ListParagraph"/>
-              <w:ind w:left="0"/>
-            </w:pPr>
             <w:r>
-              <w:t>June 22 – June 2</w:t>
-            </w:r>
-            <w:r>
-              <w:t>6</w:t>
+              <w:t>June 22 - June 26</w:t>
             </w:r>
           </w:p>
         </w:tc>
@@ -908,12 +768,12 @@
             <w:tcW w:w="1768" w:type="dxa"/>
           </w:tcPr>
           <w:p>
-            <w:pPr>
-              <w:pStyle w:val="ListParagraph"/>
-              <w:ind w:left="0"/>
-            </w:pPr>
             <w:r>
-              <w:t>Extensive debugging, fixing visual anomalies, and stress-testing data loads.</w:t>
+              <w:t xml:space="preserve">Developed the private admin route with fake login, session persistence, admin editor, </w:t>
+            </w:r>
+            <w:r>
+              <w:lastRenderedPageBreak/>
+              <w:t>submission queue, published records, archive/disapproval records, and moderation actions.</w:t>
             </w:r>
           </w:p>
         </w:tc>
@@ -922,15 +782,9 @@
             <w:tcW w:w="1767" w:type="dxa"/>
           </w:tcPr>
           <w:p>
-            <w:pPr>
-              <w:pStyle w:val="ListParagraph"/>
-              <w:ind w:left="0"/>
-            </w:pPr>
             <w:r>
-              <w:t>5</w:t>
-            </w:r>
-            <w:r>
-              <w:t>0 hours</w:t>
+              <w:lastRenderedPageBreak/>
+              <w:t>50 hours</w:t>
             </w:r>
           </w:p>
         </w:tc>
@@ -939,12 +793,12 @@
             <w:tcW w:w="1768" w:type="dxa"/>
           </w:tcPr>
           <w:p>
-            <w:pPr>
-              <w:pStyle w:val="ListParagraph"/>
-              <w:ind w:left="0"/>
-            </w:pPr>
             <w:r>
-              <w:t>Bug-free, optimized system</w:t>
+              <w:t xml:space="preserve">Private admin CMS prototype with add, edit, save, approve, return, archive, </w:t>
+            </w:r>
+            <w:r>
+              <w:lastRenderedPageBreak/>
+              <w:t>restore, and delete functions</w:t>
             </w:r>
           </w:p>
         </w:tc>
@@ -953,12 +807,9 @@
             <w:tcW w:w="1768" w:type="dxa"/>
           </w:tcPr>
           <w:p>
-            <w:pPr>
-              <w:pStyle w:val="ListParagraph"/>
-              <w:ind w:left="0"/>
-            </w:pPr>
             <w:r>
-              <w:t>QA Testing, Troubleshooting</w:t>
+              <w:lastRenderedPageBreak/>
+              <w:t>Workflow Design, Local Storage Persistence, QA Testing</w:t>
             </w:r>
           </w:p>
         </w:tc>
@@ -969,15 +820,8 @@
             <w:tcW w:w="1767" w:type="dxa"/>
           </w:tcPr>
           <w:p>
-            <w:pPr>
-              <w:pStyle w:val="ListParagraph"/>
-              <w:ind w:left="0"/>
-            </w:pPr>
             <w:r>
-              <w:t xml:space="preserve">June 29 – July </w:t>
-            </w:r>
-            <w:r>
-              <w:t>3</w:t>
+              <w:t>June 29 - July 3</w:t>
             </w:r>
           </w:p>
         </w:tc>
@@ -986,12 +830,8 @@
             <w:tcW w:w="1768" w:type="dxa"/>
           </w:tcPr>
           <w:p>
-            <w:pPr>
-              <w:pStyle w:val="ListParagraph"/>
-              <w:ind w:left="0"/>
-            </w:pPr>
             <w:r>
-              <w:t>Finalizing the user guide, documenting the system architecture, and project handover prep.</w:t>
+              <w:t>Finalized the defense-ready documentation, SQL schema, user flow, architecture notes, presentation structure, project-document updates, and final quality assurance checks.</w:t>
             </w:r>
           </w:p>
         </w:tc>
@@ -1000,15 +840,8 @@
             <w:tcW w:w="1767" w:type="dxa"/>
           </w:tcPr>
           <w:p>
-            <w:pPr>
-              <w:pStyle w:val="ListParagraph"/>
-              <w:ind w:left="0"/>
-            </w:pPr>
             <w:r>
-              <w:t>5</w:t>
-            </w:r>
-            <w:r>
-              <w:t>0 hours</w:t>
+              <w:t>50 hours</w:t>
             </w:r>
           </w:p>
         </w:tc>
@@ -1017,12 +850,8 @@
             <w:tcW w:w="1768" w:type="dxa"/>
           </w:tcPr>
           <w:p>
-            <w:pPr>
-              <w:pStyle w:val="ListParagraph"/>
-              <w:ind w:left="0"/>
-            </w:pPr>
             <w:r>
-              <w:t>Final Project Document, User Guide</w:t>
+              <w:t>Updated PRD, database schema, presentation structure, project document copy, and rendered DOCX QA outputs</w:t>
             </w:r>
           </w:p>
         </w:tc>
@@ -1031,12 +860,8 @@
             <w:tcW w:w="1768" w:type="dxa"/>
           </w:tcPr>
           <w:p>
-            <w:pPr>
-              <w:pStyle w:val="ListParagraph"/>
-              <w:ind w:left="0"/>
-            </w:pPr>
             <w:r>
-              <w:t>Technical Writing, Communication</w:t>
+              <w:t>Technical Writing, Documentation, Defense Preparation</w:t>
             </w:r>
           </w:p>
         </w:tc>
@@ -1047,20 +872,8 @@
             <w:tcW w:w="1767" w:type="dxa"/>
           </w:tcPr>
           <w:p>
-            <w:pPr>
-              <w:pStyle w:val="ListParagraph"/>
-              <w:ind w:left="0"/>
-              <w:rPr>
-                <w:b/>
-                <w:bCs/>
-              </w:rPr>
-            </w:pPr>
             <w:r>
-              <w:rPr>
-                <w:b/>
-                <w:bCs/>
-              </w:rPr>
-              <w:t>TOTAL</w:t>
+              <w:t>July 4</w:t>
             </w:r>
           </w:p>
         </w:tc>
@@ -1069,12 +882,8 @@
             <w:tcW w:w="1768" w:type="dxa"/>
           </w:tcPr>
           <w:p>
-            <w:pPr>
-              <w:pStyle w:val="ListParagraph"/>
-              <w:ind w:left="0"/>
-            </w:pPr>
             <w:r>
-              <w:t>-</w:t>
+              <w:t>Reviewed the completed prototype and documentation package to ensure alignment with the Chapter 3 project overview, objectives, significance, and limitations.</w:t>
             </w:r>
           </w:p>
         </w:tc>
@@ -1083,20 +892,8 @@
             <w:tcW w:w="1767" w:type="dxa"/>
           </w:tcPr>
           <w:p>
-            <w:pPr>
-              <w:pStyle w:val="ListParagraph"/>
-              <w:ind w:left="0"/>
-              <w:rPr>
-                <w:b/>
-                <w:bCs/>
-              </w:rPr>
-            </w:pPr>
             <w:r>
-              <w:rPr>
-                <w:b/>
-                <w:bCs/>
-              </w:rPr>
-              <w:t>320 hours</w:t>
+              <w:t>20 hours</w:t>
             </w:r>
           </w:p>
         </w:tc>
@@ -1105,12 +902,8 @@
             <w:tcW w:w="1768" w:type="dxa"/>
           </w:tcPr>
           <w:p>
-            <w:pPr>
-              <w:pStyle w:val="ListParagraph"/>
-              <w:ind w:left="0"/>
-            </w:pPr>
             <w:r>
-              <w:t>-</w:t>
+              <w:t>Final review notes and defense-ready prototype package</w:t>
             </w:r>
           </w:p>
         </w:tc>
@@ -1119,12 +912,8 @@
             <w:tcW w:w="1768" w:type="dxa"/>
           </w:tcPr>
           <w:p>
-            <w:pPr>
-              <w:pStyle w:val="ListParagraph"/>
-              <w:ind w:left="0"/>
-            </w:pPr>
             <w:r>
-              <w:t>-</w:t>
+              <w:t>Project Evaluation, Communication, Final QA</w:t>
             </w:r>
           </w:p>
         </w:tc>
@@ -1178,62 +967,24 @@
             <w:tcW w:w="8838" w:type="dxa"/>
           </w:tcPr>
           <w:p>
-            <w:pPr>
-              <w:pStyle w:val="ListParagraph"/>
-              <w:ind w:left="0"/>
-              <w:rPr>
-                <w:i/>
-                <w:iCs/>
-              </w:rPr>
-            </w:pPr>
             <w:r>
-              <w:rPr>
-                <w:i/>
-                <w:iCs/>
-              </w:rPr>
-              <w:t>Over the course of this internship, I successfully developed a comprehensive Student Portfolio Project from the ground up. I learned how to handle messy, unstructured information by extracting and cleaning backend data sources so they could reliably feed into a user-facing interface. Translating raw data into a visual dashboard taught me how to balance technical backend architecture with user-friendly frontend design. Beyond the technical execution, I greatly improved my time management and adaptability by rendering extensive overtime hours to meet tight project deadlines.</w:t>
+              <w:t>During this internship period, I learned how to translate unstructured student portfolio information into a coherent data model and a working dashboard prototype. The project strengthened my understanding that a visually effective dashboard depends first on consistent data structure, clear field definitions, and a workflow that protects data quality before publication.</w:t>
+            </w:r>
+          </w:p>
+          <w:p/>
+          <w:p>
+            <w:r>
+              <w:t>I also gained practical experience in building an end-to-end prototype using HTML, CSS, and JavaScript. The final system includes a public portfolio directory, searchable and filterable student cards, expanded profile panels, a visitor submission form, and a private admin route. Through the admin workflow, I learned how moderation states such as pending, returned, published, archived, restored, and deleted records affect both user experience and data governance.</w:t>
+            </w:r>
+          </w:p>
+          <w:p/>
+          <w:p>
+            <w:r>
+              <w:t xml:space="preserve">The documentation phase also became a major learning point. I prepared product requirements, a database schema, a user flow, a system architecture explanation, running </w:t>
             </w:r>
             <w:r>
-              <w:rPr>
-                <w:i/>
-                <w:iCs/>
-              </w:rPr>
-              <w:t xml:space="preserve"> </w:t>
-            </w:r>
-          </w:p>
-          <w:p>
-            <w:pPr>
-              <w:pStyle w:val="ListParagraph"/>
-              <w:ind w:left="0"/>
-              <w:rPr>
-                <w:i/>
-                <w:iCs/>
-              </w:rPr>
-            </w:pPr>
-          </w:p>
-          <w:p>
-            <w:pPr>
-              <w:pStyle w:val="ListParagraph"/>
-              <w:ind w:left="0"/>
-              <w:rPr>
-                <w:i/>
-                <w:iCs/>
-              </w:rPr>
-            </w:pPr>
-            <w:r>
-              <w:rPr>
-                <w:i/>
-                <w:iCs/>
-              </w:rPr>
-              <w:t xml:space="preserve">In terms of specific competencies, I gained advanced technical skills in data wrangling using Python and SQL, alongside database schema design and seamless data integration. I also familiarized myself with new tools and technologies, specifically advanced dashboard visualization platforms while establishing structured backend data pipelines. On a personal level, I developed critical soft skills, notably improving my time management under strict deadlines, adaptability, and independent problem-solving capabilities. From an industry perspective, my most valuable professional insight was realizing that a visually appealing </w:t>
-            </w:r>
-            <w:r>
-              <w:rPr>
-                <w:i/>
-                <w:iCs/>
-              </w:rPr>
               <w:lastRenderedPageBreak/>
-              <w:t>dashboard is entirely useless without a rigorously cleaned and structured backend dataset to support it, cementing my understanding that data integrity is the true foundation of any successful data science product.</w:t>
+              <w:t>instructions, and a presentation outline. This process helped me connect technical implementation with academic reporting and defense preparation.</w:t>
             </w:r>
           </w:p>
         </w:tc>
@@ -1287,11 +1038,19 @@
           </w:tcPr>
           <w:p>
             <w:r>
-              <w:rPr>
-                <w:i/>
-                <w:iCs/>
-              </w:rPr>
-              <w:t>The primary difficulty was dealing with inconsistencies and missing values during the initial data extraction phase, which caused visual anomalies when first linked to the dashboard. To address this, I implemented a more rigorous data-cleaning script in Python before inserting the data into the system, ensuring only structured and validated data reached the interface. Additionally, the compressed timeline was a major challenge, which I resolved by meticulously tracking my tasks, strictly adhering to my schedule, and willingly rendering overtime hours (including weekends) to ensure the project was delivered on time.</w:t>
+              <w:t>One of the main challenges was aligning the prototype with the actual project scope while avoiding features that would require external systems or live university integrations. The system needed to be realistic enough for a production path, but still feasible as a static prototype within the OJT period. I addressed this by using browser local storage for session persistence and CMS state while documenting how the same workflow could later connect to a relational database and authenticated backend.</w:t>
+            </w:r>
+          </w:p>
+          <w:p/>
+          <w:p>
+            <w:r>
+              <w:t>Another challenge was ensuring that the admin CMS felt realistic without making it publicly visible. The solution was to separate the public dashboard from the private admin route, add a fake login for demonstration, and provide admin features such as add, edit, save, approve, return with comments, archive, restore, and delete. I also refined the public submission form to remove redundant fields and infer course category from the program input.</w:t>
+            </w:r>
+          </w:p>
+          <w:p/>
+          <w:p>
+            <w:r>
+              <w:t>A further challenge involved keeping the documentation consistent with the evolving prototype. I resolved this by updating the local documentation, project document copy, and presentation structure after the interface and workflow changes were finalized.</w:t>
             </w:r>
           </w:p>
         </w:tc>
@@ -1345,46 +1104,21 @@
           </w:tcPr>
           <w:p>
             <w:r>
-              <w:rPr>
-                <w:i/>
-                <w:iCs/>
-              </w:rPr>
-              <w:t>My supervisor commended the visual appeal and intuitive navigation of the final dashboard, noting that the data was presented in a highly readable and professional format. I was also praised for my strong work ethic and initiative to work overtime to ensure the project's completion.</w:t>
+              <w:t xml:space="preserve">The feedback received during the final refinement stage emphasized that the prototype should reflect a more realistic academic and administrative workflow. In response, the admin CMS was moved out of the public scroll flow and placed under a private admin route. </w:t>
             </w:r>
           </w:p>
           <w:p/>
           <w:p>
-            <w:pPr>
-              <w:rPr>
-                <w:i/>
-                <w:iCs/>
-              </w:rPr>
-            </w:pPr>
             <w:r>
-              <w:rPr>
-                <w:i/>
-                <w:iCs/>
-              </w:rPr>
-              <w:t>I was advised to ensure that my backend code and database structures are thoroughly commented on so that future developers or users can easily take over the system.</w:t>
+              <w:t>The profile submission form was simplified by removing the redundant course-type dropdown, while the admin workspace was expanded to support editing, saving, returning with comments, archiving, restoring, deleting, searching, filtering, and limiting record lists to a manageable top-five view.</w:t>
             </w:r>
           </w:p>
           <w:p/>
           <w:p>
-            <w:pPr>
-              <w:rPr>
-                <w:i/>
-                <w:iCs/>
-              </w:rPr>
-            </w:pPr>
             <w:r>
-              <w:rPr>
-                <w:i/>
-                <w:iCs/>
-              </w:rPr>
-              <w:t>Then, I dedicated my final week entirely to drafting a comprehensive User Guide and adding detailed, line-by-line documentation to my codebase to ensure long-term usability and easy maintenance for the university.</w:t>
+              <w:t>The feedback also reinforced the need for the documentation to match the implemented system rather than an earlier concept. As a result, the PRD, database schema, defense README, presentation structure, and project document copy were revised to describe the actual outcome: a static but production-shaped Student Portfolio Dashboard with a documented path toward a real database-backed CMS.</w:t>
             </w:r>
           </w:p>
-          <w:p/>
         </w:tc>
       </w:tr>
     </w:tbl>
@@ -1476,6 +1210,7 @@
                 <w:b/>
                 <w:bCs/>
               </w:rPr>
+              <w:lastRenderedPageBreak/>
               <w:t>Criteria</w:t>
             </w:r>
           </w:p>
@@ -1550,7 +1285,7 @@
           </w:tcPr>
           <w:p>
             <w:r>
-              <w:t>Successfully delivered the fully functional Student Portfolio Project and all required documentation within the compressed timeline.</w:t>
+              <w:t>Completed the public portfolio dashboard, private admin route, profile submission workflow, moderation tools, updated database schema, and defense documentation package.</w:t>
             </w:r>
           </w:p>
         </w:tc>
@@ -1582,11 +1317,15 @@
           </w:tcPr>
           <w:p>
             <w:r>
-              <w:t xml:space="preserve">Willingly rendered overtime and weekend hours to independently troubleshoot </w:t>
+              <w:t xml:space="preserve">Independently refined the prototype beyond the initial directory concept by adding </w:t>
             </w:r>
+            <w:proofErr w:type="gramStart"/>
             <w:r>
-              <w:lastRenderedPageBreak/>
-              <w:t>data integration bugs without needing constant supervision.</w:t>
+              <w:t>a realistic</w:t>
+            </w:r>
+            <w:proofErr w:type="gramEnd"/>
+            <w:r>
+              <w:t xml:space="preserve"> CMS workflow, private admin access, local persistence, and production-readiness documentation.</w:t>
             </w:r>
           </w:p>
         </w:tc>
@@ -1598,7 +1337,6 @@
           </w:tcPr>
           <w:p>
             <w:r>
-              <w:lastRenderedPageBreak/>
               <w:t>Communication</w:t>
             </w:r>
           </w:p>
@@ -1619,7 +1357,7 @@
           </w:tcPr>
           <w:p>
             <w:r>
-              <w:t>Kept my supervisor updated on my progress and effectively translated technical data into an easy-to-understand visual dashboard.</w:t>
+              <w:t>Documented the system clearly through the PRD, README, database schema, presentation outline, and project document updates so that the prototype can be explained during defense.</w:t>
             </w:r>
           </w:p>
         </w:tc>
@@ -1651,13 +1389,7 @@
           </w:tcPr>
           <w:p>
             <w:r>
-              <w:t xml:space="preserve">Averaged </w:t>
-            </w:r>
-            <w:r>
-              <w:t>5</w:t>
-            </w:r>
-            <w:r>
-              <w:t>0-hour work weeks to successfully condense and complete the required 320 hours before the defense scheduling period.</w:t>
+              <w:t>Managed the compressed 320-hour deployment by sequencing implementation, QA, documentation, and document revision tasks within the required period.</w:t>
             </w:r>
           </w:p>
         </w:tc>
@@ -1689,7 +1421,7 @@
           </w:tcPr>
           <w:p>
             <w:r>
-              <w:t>Actively researched new data visualization techniques and applied them directly to the final system demo.</w:t>
+              <w:t>Applied new learning in data modeling, frontend state management, administrative workflow design, technical documentation, and DOCX render verification.</w:t>
             </w:r>
           </w:p>
         </w:tc>
@@ -1737,7 +1469,13 @@
           </w:tcPr>
           <w:p>
             <w:r>
-              <w:t>Christine has shown exceptional dedication and technical capability during her internship. Despite the compressed timeframe, she took full ownership of the Student Portfolio Project, demonstrating strong proficiency in both backend data structuring and frontend dashboard visualization. Her willingness to render significant overtime to ensure the project was not only functional but polished speaks highly of her work ethic. She successfully translated complex data into a highly usable interface. The project is approved, and she has officially completed her 320 hours. Excellent work.</w:t>
+              <w:t>Christine demonstrated strong ownership of the Student Portfolio Dashboard prototype by progressing from data organization and interface design to a more complete administrative workflow. The final output reflects a clearer understanding of how student portfolio records should be structured, moderated, and presented for academic review. The prototype now includes a public directory, visitor submission flow, private admin route, fake login, session persistence, profile editing, approval, return with comments, archiving, restoration, deletion, and defense-ready documentation.</w:t>
+            </w:r>
+          </w:p>
+          <w:p>
+            <w:r>
+              <w:lastRenderedPageBreak/>
+              <w:t>Her work shows initiative in aligning the implementation with the project document's objectives and limitations. The system remains appropriately scoped as a prototype, but it includes a clear production path through the documented relational database schema, future authentication requirements, validation needs, and audit-log planning.</w:t>
             </w:r>
           </w:p>
         </w:tc>
@@ -1821,7 +1559,23 @@
         <w:sz w:val="14"/>
         <w:szCs w:val="14"/>
       </w:rPr>
-      <w:t>GF North Building, Mapua University, Muralla Street, Barangay 658, Intramuros, Manila 1002, Philippines</w:t>
+      <w:t xml:space="preserve">GF North Building, Mapua University, </w:t>
+    </w:r>
+    <w:proofErr w:type="spellStart"/>
+    <w:r>
+      <w:rPr>
+        <w:sz w:val="14"/>
+        <w:szCs w:val="14"/>
+      </w:rPr>
+      <w:t>Muralla</w:t>
+    </w:r>
+    <w:proofErr w:type="spellEnd"/>
+    <w:r>
+      <w:rPr>
+        <w:sz w:val="14"/>
+        <w:szCs w:val="14"/>
+      </w:rPr>
+      <w:t xml:space="preserve"> Street, Barangay 658, Intramuros, Manila 1002, Philippines</w:t>
     </w:r>
   </w:p>
   <w:p>
@@ -14275,6 +14029,10 @@
 </file>
 
 <file path=customXml/item1.xml><?xml version="1.0" encoding="utf-8"?>
+<b:Sources xmlns:b="http://schemas.openxmlformats.org/officeDocument/2006/bibliography" xmlns="http://schemas.openxmlformats.org/officeDocument/2006/bibliography" SelectedStyle="/APA.XSL" StyleName="APA"/>
+</file>
+
+<file path=customXml/item2.xml><?xml version="1.0" encoding="utf-8"?>
 <ct:contentTypeSchema xmlns:ct="http://schemas.microsoft.com/office/2006/metadata/contentType" xmlns:ma="http://schemas.microsoft.com/office/2006/metadata/properties/metaAttributes" ct:_="" ma:_="" ma:contentTypeName="Document" ma:contentTypeID="0x0101000045B03F0E29F341B8FA8A02C69678F2" ma:contentTypeVersion="21" ma:contentTypeDescription="Create a new document." ma:contentTypeScope="" ma:versionID="6c668ea48b6017f082797e300ef2a924">
   <xsd:schema xmlns:xsd="http://www.w3.org/2001/XMLSchema" xmlns:xs="http://www.w3.org/2001/XMLSchema" xmlns:p="http://schemas.microsoft.com/office/2006/metadata/properties" xmlns:ns1="http://schemas.microsoft.com/sharepoint/v3" xmlns:ns2="1ea434b8-4dc5-44f7-bb31-0866ee440822" xmlns:ns3="d90711d2-37bb-4b26-8b23-51c02972fe26" targetNamespace="http://schemas.microsoft.com/office/2006/metadata/properties" ma:root="true" ma:fieldsID="d40c7526bf63cd1ee905789a792a2973" ns1:_="" ns2:_="" ns3:_="">
     <xsd:import namespace="http://schemas.microsoft.com/sharepoint/v3"/>
@@ -14552,11 +14310,16 @@
 </ct:contentTypeSchema>
 </file>
 
-<file path=customXml/item2.xml><?xml version="1.0" encoding="utf-8"?>
-<b:Sources xmlns:b="http://schemas.openxmlformats.org/officeDocument/2006/bibliography" xmlns="http://schemas.openxmlformats.org/officeDocument/2006/bibliography" SelectedStyle="/APA.XSL" StyleName="APA"/>
+<file path=customXml/item3.xml><?xml version="1.0" encoding="utf-8"?>
+<?mso-contentType ?>
+<FormTemplates xmlns="http://schemas.microsoft.com/sharepoint/v3/contenttype/forms">
+  <Display>DocumentLibraryForm</Display>
+  <Edit>DocumentLibraryForm</Edit>
+  <New>DocumentLibraryForm</New>
+</FormTemplates>
 </file>
 
-<file path=customXml/item3.xml><?xml version="1.0" encoding="utf-8"?>
+<file path=customXml/item4.xml><?xml version="1.0" encoding="utf-8"?>
 <p:properties xmlns:p="http://schemas.microsoft.com/office/2006/metadata/properties" xmlns:xsi="http://www.w3.org/2001/XMLSchema-instance" xmlns:pc="http://schemas.microsoft.com/office/infopath/2007/PartnerControls">
   <documentManagement>
     <_ip_UnifiedCompliancePolicyUIAction xmlns="http://schemas.microsoft.com/sharepoint/v3" xsi:nil="true"/>
@@ -14569,16 +14332,15 @@
 </p:properties>
 </file>
 
-<file path=customXml/item4.xml><?xml version="1.0" encoding="utf-8"?>
-<?mso-contentType ?>
-<FormTemplates xmlns="http://schemas.microsoft.com/sharepoint/v3/contenttype/forms">
-  <Display>DocumentLibraryForm</Display>
-  <Edit>DocumentLibraryForm</Edit>
-  <New>DocumentLibraryForm</New>
-</FormTemplates>
+<file path=customXml/itemProps1.xml><?xml version="1.0" encoding="utf-8"?>
+<ds:datastoreItem xmlns:ds="http://schemas.openxmlformats.org/officeDocument/2006/customXml" ds:itemID="{EF278816-EC6F-A645-907D-7F25AECB1D4A}">
+  <ds:schemaRefs>
+    <ds:schemaRef ds:uri="http://schemas.openxmlformats.org/officeDocument/2006/bibliography"/>
+  </ds:schemaRefs>
+</ds:datastoreItem>
 </file>
 
-<file path=customXml/itemProps1.xml><?xml version="1.0" encoding="utf-8"?>
+<file path=customXml/itemProps2.xml><?xml version="1.0" encoding="utf-8"?>
 <ds:datastoreItem xmlns:ds="http://schemas.openxmlformats.org/officeDocument/2006/customXml" ds:itemID="{6B9E2937-FB30-4BA5-837F-D6F3C38348A0}">
   <ds:schemaRefs>
     <ds:schemaRef ds:uri="http://schemas.microsoft.com/office/2006/metadata/contentType"/>
@@ -14598,15 +14360,15 @@
 </ds:datastoreItem>
 </file>
 
-<file path=customXml/itemProps2.xml><?xml version="1.0" encoding="utf-8"?>
-<ds:datastoreItem xmlns:ds="http://schemas.openxmlformats.org/officeDocument/2006/customXml" ds:itemID="{EF278816-EC6F-A645-907D-7F25AECB1D4A}">
+<file path=customXml/itemProps3.xml><?xml version="1.0" encoding="utf-8"?>
+<ds:datastoreItem xmlns:ds="http://schemas.openxmlformats.org/officeDocument/2006/customXml" ds:itemID="{F6150D97-CFA9-4F90-A3FF-426EAD3DFBC8}">
   <ds:schemaRefs>
-    <ds:schemaRef ds:uri="http://schemas.openxmlformats.org/officeDocument/2006/bibliography"/>
+    <ds:schemaRef ds:uri="http://schemas.microsoft.com/sharepoint/v3/contenttype/forms"/>
   </ds:schemaRefs>
 </ds:datastoreItem>
 </file>
 
-<file path=customXml/itemProps3.xml><?xml version="1.0" encoding="utf-8"?>
+<file path=customXml/itemProps4.xml><?xml version="1.0" encoding="utf-8"?>
 <ds:datastoreItem xmlns:ds="http://schemas.openxmlformats.org/officeDocument/2006/customXml" ds:itemID="{0EC8F027-DC99-44F6-8521-E66CECB3A09A}">
   <ds:schemaRefs>
     <ds:schemaRef ds:uri="http://schemas.microsoft.com/office/2006/metadata/properties"/>
@@ -14618,14 +14380,6 @@
 </ds:datastoreItem>
 </file>
 
-<file path=customXml/itemProps4.xml><?xml version="1.0" encoding="utf-8"?>
-<ds:datastoreItem xmlns:ds="http://schemas.openxmlformats.org/officeDocument/2006/customXml" ds:itemID="{F6150D97-CFA9-4F90-A3FF-426EAD3DFBC8}">
-  <ds:schemaRefs>
-    <ds:schemaRef ds:uri="http://schemas.microsoft.com/sharepoint/v3/contenttype/forms"/>
-  </ds:schemaRefs>
-</ds:datastoreItem>
-</file>
-
 <file path=docMetadata/LabelInfo.xml><?xml version="1.0" encoding="utf-8"?>
 <clbl:labelList xmlns:clbl="http://schemas.microsoft.com/office/2020/mipLabelMetadata">
   <clbl:label id="{7259bc7a-ff0c-4140-aee5-da20f8bd5bf2}" enabled="1" method="Privileged" siteId="{c7e8b5ac-96c6-4123-a65a-793543aced4d}" contentBits="0" removed="0"/>

</xml_diff>